<commit_message>
Update proposal: reference Kazakhstan AI law, tighten international examples
Co-Authored-By: Claude Sonnet 5.5 <noreply@anthropic.com>
Claude-Session: https://claude.ai/code/session_01AYaz8Rn1jjHvfibJzy3uRq
</commit_message>
<xml_diff>
--- a/quryltai/Ұсыныс_ЭТӘБ_толық_нұсқа.docx
+++ b/quryltai/Ұсыныс_ЭТӘБ_толық_нұсқа.docx
@@ -88,7 +88,15 @@
         <w:pStyle w:val="ListBullet"/>
       </w:pPr>
       <w:r>
-        <w:t>ТКШ-да төлем, тариф, шағым және көрсеткіш беру цифрлық арнаға көшіп барады. Алгоритмдердің азаматқа әсерін бағалайтын бірыңғай талап жоқ.</w:t>
+        <w:t>Қазақстанда ЖИ туралы заң (2025 жылы қабылданып, 2026 жылдың қаңтарында күшіне енген) әділдік, айқындық, түсіндірмелілік, есеп берушілік және бақылау қағидаттарын бекітті. Келесі қадам: осы қағидаттарды мемлекеттік органдарда бірдей тексеретін қолданбалы құрал (нысан, тізілім, сатып алу талабы).</w:t>
+      </w:r>
+    </w:p>
+    <w:p>
+      <w:pPr>
+        <w:pStyle w:val="ListBullet"/>
+      </w:pPr>
+      <w:r>
+        <w:t>ТКШ-да төлем, тариф, шағым және көрсеткіш беру цифрлық арнаға көшіп барады, сондықтан алгоритмнің азаматқа әсерін алдын ала бағалау ерекше маңызды.</w:t>
       </w:r>
     </w:p>
     <w:p>
@@ -212,7 +220,7 @@
         <w:pStyle w:val="ListBullet"/>
       </w:pPr>
       <w:r>
-        <w:t>Канада: Directive on Automated Decision-Making және Algorithmic Impact Assessment: федералды органдардағы автоматтандырылған шешімдерге әсерді бағалау міндетті, нәтижеге қарай талаптар күшейеді.</w:t>
+        <w:t>Қазақстан: «Жасанды интеллект туралы» заң (2025): әділдік, түсіндірмелілік, есеп берушілік қағидаттары. Ұсыныс осы заңды іске асыруға бағытталған.</w:t>
       </w:r>
     </w:p>
     <w:p>
@@ -220,7 +228,15 @@
         <w:pStyle w:val="ListBullet"/>
       </w:pPr>
       <w:r>
-        <w:t>Ұлыбритания: Algorithmic Transparency Recording Standard: мемлекеттік алгоритмдерді ашық түрде тіркеу стандарты.</w:t>
+        <w:t>Канада: Directive on Automated Decision-Making және Algorithmic Impact Assessment: федералды органдарда автоматтандырылған шешімдердің әсерін жүйені іске қосар алдында бағалау және жариялау міндетті; сауалнама нәтижесі әсер деңгейін (I–IV) анықтайды, деңгей жоғарылаған сайын талаптар күшейеді.</w:t>
+      </w:r>
+    </w:p>
+    <w:p>
+      <w:pPr>
+        <w:pStyle w:val="ListBullet"/>
+      </w:pPr>
+      <w:r>
+        <w:t>Ұлыбритания: Algorithmic Transparency Recording Standard: мемлекеттік алгоритмдерді ашық тіркеу стандарты, орталық үкімет органдары үшін міндетті болды.</w:t>
       </w:r>
     </w:p>
     <w:p>
@@ -236,7 +252,7 @@
         <w:pStyle w:val="ListBullet"/>
       </w:pPr>
       <w:r>
-        <w:t>Нидерланды: әлеуметтік жәрдемақы бойынша алгоритмдік бақылау жанжалы (toeslagenaffaire) бағалаусыз және адам бақылауынсыз қолданылған алгоритмнің азаматтарға келтіретін зиянын көрсетті.</w:t>
+        <w:t>Нидерланды: балаларды күтуге берілетін жәрдемақы жанжалы (toeslagenaffaire): салық органының тәуекел модельдері қос азаматтықты күмән белгісі ретінде пайдаланып, мыңдаған отбасыға зиян келтірді; үкімет 2021 жылы қызметінен кетті, дерекқорлық құзырлы орган салық органына айыппұл салды.</w:t>
       </w:r>
     </w:p>
     <w:p>
@@ -275,7 +291,7 @@
         <w:pStyle w:val="ListNumber"/>
       </w:pPr>
       <w:r>
-        <w:t>Қолданыстағы цифрландыру және ЖИ заңнамасына мемлекеттік органдардағы ЖИ-ға қойылатын талаптарды (ЭТӘБ міндеттілігі, тізілімге тіркеу, адамға жүгіну құқығы) енгізу.</w:t>
+        <w:t>Қолданыстағы ЖИ туралы заңның нормаларын (қағидаттар, тәуекел бойынша жіктеу, автоматты шешімге шағымдану) мемлекеттік органдарда қолдануға нақтылау; заңда жоқ бөлігін (ЭТӘБ міндеттілігі, тізілім, тәуелділік өлшемдері) толықтыру.</w:t>
       </w:r>
     </w:p>
     <w:p>

</xml_diff>